<commit_message>
updated component list and powerpoint
</commit_message>
<xml_diff>
--- a/Resume/DelayGrad/DelayGrad.docx
+++ b/Resume/DelayGrad/DelayGrad.docx
@@ -569,7 +569,23 @@
           <w:sz w:val="18"/>
           <w:szCs w:val="18"/>
         </w:rPr>
-        <w:t>Oct 2023 - Present</w:t>
+        <w:t>Oct 202</w:t>
+      </w:r>
+      <w:r>
+        <w:rPr>
+          <w:rFonts w:ascii="Verdana" w:hAnsi="Verdana"/>
+          <w:sz w:val="18"/>
+          <w:szCs w:val="18"/>
+        </w:rPr>
+        <w:t>4</w:t>
+      </w:r>
+      <w:r>
+        <w:rPr>
+          <w:rFonts w:ascii="Verdana" w:hAnsi="Verdana"/>
+          <w:sz w:val="18"/>
+          <w:szCs w:val="18"/>
+        </w:rPr>
+        <w:t xml:space="preserve"> - Present</w:t>
       </w:r>
     </w:p>
     <w:p>
@@ -822,25 +838,7 @@
           <w:sz w:val="18"/>
           <w:szCs w:val="18"/>
         </w:rPr>
-        <w:t>Configured ROS2 on Jetson Nano/</w:t>
-      </w:r>
-      <w:proofErr w:type="spellStart"/>
-      <w:r>
-        <w:rPr>
-          <w:rFonts w:ascii="Verdana" w:hAnsi="Verdana"/>
-          <w:sz w:val="18"/>
-          <w:szCs w:val="18"/>
-        </w:rPr>
-        <w:t>JetBot</w:t>
-      </w:r>
-      <w:proofErr w:type="spellEnd"/>
-      <w:r>
-        <w:rPr>
-          <w:rFonts w:ascii="Verdana" w:hAnsi="Verdana"/>
-          <w:sz w:val="18"/>
-          <w:szCs w:val="18"/>
-        </w:rPr>
-        <w:t xml:space="preserve"> with workspace setup and Gazebo integration.</w:t>
+        <w:t>Configured ROS2 on Jetson Nano/JetBot with workspace setup and Gazebo integration.</w:t>
       </w:r>
     </w:p>
     <w:p>
@@ -862,25 +860,7 @@
           <w:sz w:val="18"/>
           <w:szCs w:val="18"/>
         </w:rPr>
-        <w:t xml:space="preserve">Integrated object detection, behavior trees, state machines, and action servers so the </w:t>
-      </w:r>
-      <w:proofErr w:type="spellStart"/>
-      <w:r>
-        <w:rPr>
-          <w:rFonts w:ascii="Verdana" w:hAnsi="Verdana"/>
-          <w:sz w:val="18"/>
-          <w:szCs w:val="18"/>
-        </w:rPr>
-        <w:t>JetBot</w:t>
-      </w:r>
-      <w:proofErr w:type="spellEnd"/>
-      <w:r>
-        <w:rPr>
-          <w:rFonts w:ascii="Verdana" w:hAnsi="Verdana"/>
-          <w:sz w:val="18"/>
-          <w:szCs w:val="18"/>
-        </w:rPr>
-        <w:t xml:space="preserve"> can find and follow </w:t>
+        <w:t xml:space="preserve">Integrated object detection, behavior trees, state machines, and action servers so the JetBot can find and follow </w:t>
       </w:r>
       <w:r>
         <w:rPr>
@@ -3546,6 +3526,7 @@
   <w:style w:type="character" w:default="1" w:styleId="DefaultParagraphFont">
     <w:name w:val="Default Paragraph Font"/>
     <w:uiPriority w:val="1"/>
+    <w:semiHidden/>
     <w:unhideWhenUsed/>
   </w:style>
   <w:style w:type="table" w:default="1" w:styleId="TableNormal">

</xml_diff>